<commit_message>
Review and complete Milstone 1 documents
</commit_message>
<xml_diff>
--- a/docs/business-problem-and-scope.docx
+++ b/docs/business-problem-and-scope.docx
@@ -10,6 +10,8 @@
           <w:rFonts w:ascii="Times New Roman" w:hAnsi="Times New Roman" w:cs="Times New Roman"/>
           <w:b/>
           <w:bCs/>
+          <w:sz w:val="28"/>
+          <w:szCs w:val="28"/>
           <w:lang w:val="en-US"/>
         </w:rPr>
       </w:pPr>
@@ -18,6 +20,8 @@
           <w:rFonts w:ascii="Times New Roman" w:hAnsi="Times New Roman" w:cs="Times New Roman"/>
           <w:b/>
           <w:bCs/>
+          <w:sz w:val="28"/>
+          <w:szCs w:val="28"/>
           <w:lang w:val="en-US"/>
         </w:rPr>
         <w:t xml:space="preserve">Employee Shift-Swap System </w:t>
@@ -31,6 +35,8 @@
           <w:rFonts w:ascii="Times New Roman" w:hAnsi="Times New Roman" w:cs="Times New Roman"/>
           <w:b/>
           <w:bCs/>
+          <w:sz w:val="28"/>
+          <w:szCs w:val="28"/>
           <w:lang w:val="en-US"/>
         </w:rPr>
       </w:pPr>
@@ -39,6 +45,8 @@
           <w:rFonts w:ascii="Times New Roman" w:hAnsi="Times New Roman" w:cs="Times New Roman"/>
           <w:b/>
           <w:bCs/>
+          <w:sz w:val="28"/>
+          <w:szCs w:val="28"/>
           <w:lang w:val="en-US"/>
         </w:rPr>
         <w:t>Business Problem + Scope</w:t>
@@ -51,6 +59,8 @@
           <w:rFonts w:ascii="Times New Roman" w:hAnsi="Times New Roman" w:cs="Times New Roman"/>
           <w:b/>
           <w:bCs/>
+          <w:sz w:val="28"/>
+          <w:szCs w:val="28"/>
           <w:lang w:val="en-US"/>
         </w:rPr>
       </w:pPr>
@@ -59,6 +69,8 @@
           <w:rFonts w:ascii="Times New Roman" w:hAnsi="Times New Roman" w:cs="Times New Roman"/>
           <w:b/>
           <w:bCs/>
+          <w:sz w:val="28"/>
+          <w:szCs w:val="28"/>
           <w:lang w:val="en-US"/>
         </w:rPr>
         <w:t>Business Problem</w:t>
@@ -69,15 +81,109 @@
         <w:spacing w:line="360" w:lineRule="auto"/>
         <w:rPr>
           <w:rFonts w:ascii="Times New Roman" w:hAnsi="Times New Roman" w:cs="Times New Roman"/>
-          <w:lang w:val="en-US"/>
-        </w:rPr>
-      </w:pPr>
-      <w:r>
-        <w:rPr>
-          <w:rFonts w:ascii="Times New Roman" w:hAnsi="Times New Roman" w:cs="Times New Roman"/>
-          <w:lang w:val="en-US"/>
-        </w:rPr>
-        <w:t xml:space="preserve">Currently there is not a formal way an employee can shift swap, so they do it through text messages, phone calls, or a conversation, which makes it very difficult for the manager to approve and verify if the swap works. Before the manager approves the swap, both employees must agree, the manager must confirm that both employees are qualified for the roles covered and make sure there is not a scheduling conflict. </w:t>
+          <w:sz w:val="28"/>
+          <w:szCs w:val="28"/>
+          <w:lang w:val="en-US"/>
+        </w:rPr>
+      </w:pPr>
+      <w:r>
+        <w:rPr>
+          <w:rFonts w:ascii="Times New Roman" w:hAnsi="Times New Roman" w:cs="Times New Roman"/>
+          <w:sz w:val="28"/>
+          <w:szCs w:val="28"/>
+          <w:lang w:val="en-US"/>
+        </w:rPr>
+        <w:t>Currently</w:t>
+      </w:r>
+      <w:r>
+        <w:rPr>
+          <w:rFonts w:ascii="Times New Roman" w:hAnsi="Times New Roman" w:cs="Times New Roman"/>
+          <w:sz w:val="28"/>
+          <w:szCs w:val="28"/>
+          <w:lang w:val="en-US"/>
+        </w:rPr>
+        <w:t>,</w:t>
+      </w:r>
+      <w:r>
+        <w:rPr>
+          <w:rFonts w:ascii="Times New Roman" w:hAnsi="Times New Roman" w:cs="Times New Roman"/>
+          <w:sz w:val="28"/>
+          <w:szCs w:val="28"/>
+          <w:lang w:val="en-US"/>
+        </w:rPr>
+        <w:t xml:space="preserve"> there is </w:t>
+      </w:r>
+      <w:r>
+        <w:rPr>
+          <w:rFonts w:ascii="Times New Roman" w:hAnsi="Times New Roman" w:cs="Times New Roman"/>
+          <w:sz w:val="28"/>
+          <w:szCs w:val="28"/>
+          <w:lang w:val="en-US"/>
+        </w:rPr>
+        <w:t>not</w:t>
+      </w:r>
+      <w:r>
+        <w:rPr>
+          <w:rFonts w:ascii="Times New Roman" w:hAnsi="Times New Roman" w:cs="Times New Roman"/>
+          <w:sz w:val="28"/>
+          <w:szCs w:val="28"/>
+          <w:lang w:val="en-US"/>
+        </w:rPr>
+        <w:t xml:space="preserve"> a formal way an employee can shift swap</w:t>
+      </w:r>
+      <w:r>
+        <w:rPr>
+          <w:rFonts w:ascii="Times New Roman" w:hAnsi="Times New Roman" w:cs="Times New Roman"/>
+          <w:sz w:val="28"/>
+          <w:szCs w:val="28"/>
+          <w:lang w:val="en-US"/>
+        </w:rPr>
+        <w:t xml:space="preserve">. Instead, requests are handled </w:t>
+      </w:r>
+      <w:r>
+        <w:rPr>
+          <w:rFonts w:ascii="Times New Roman" w:hAnsi="Times New Roman" w:cs="Times New Roman"/>
+          <w:sz w:val="28"/>
+          <w:szCs w:val="28"/>
+          <w:lang w:val="en-US"/>
+        </w:rPr>
+        <w:t>through text messages, phone calls, or a</w:t>
+      </w:r>
+      <w:r>
+        <w:rPr>
+          <w:rFonts w:ascii="Times New Roman" w:hAnsi="Times New Roman" w:cs="Times New Roman"/>
+          <w:sz w:val="28"/>
+          <w:szCs w:val="28"/>
+          <w:lang w:val="en-US"/>
+        </w:rPr>
+        <w:t>n in-person</w:t>
+      </w:r>
+      <w:r>
+        <w:rPr>
+          <w:rFonts w:ascii="Times New Roman" w:hAnsi="Times New Roman" w:cs="Times New Roman"/>
+          <w:sz w:val="28"/>
+          <w:szCs w:val="28"/>
+          <w:lang w:val="en-US"/>
+        </w:rPr>
+        <w:t xml:space="preserve"> conversation, which makes it very difficult for the manager to </w:t>
+      </w:r>
+      <w:r>
+        <w:rPr>
+          <w:rFonts w:ascii="Times New Roman" w:hAnsi="Times New Roman" w:cs="Times New Roman"/>
+          <w:sz w:val="28"/>
+          <w:szCs w:val="28"/>
+          <w:lang w:val="en-US"/>
+        </w:rPr>
+        <w:t xml:space="preserve">track, approve, and </w:t>
+      </w:r>
+      <w:r>
+        <w:rPr>
+          <w:rFonts w:ascii="Times New Roman" w:hAnsi="Times New Roman" w:cs="Times New Roman"/>
+          <w:sz w:val="28"/>
+          <w:szCs w:val="28"/>
+          <w:lang w:val="en-US"/>
+        </w:rPr>
+        <w:t xml:space="preserve">verify if the swap works. Before the manager approves the swap, both employees must agree, the manager must confirm that both employees are qualified for the roles covered and make sure there is not a scheduling conflict. </w:t>
       </w:r>
     </w:p>
     <w:p>
@@ -87,6 +193,8 @@
           <w:rFonts w:ascii="Times New Roman" w:hAnsi="Times New Roman" w:cs="Times New Roman"/>
           <w:b/>
           <w:bCs/>
+          <w:sz w:val="28"/>
+          <w:szCs w:val="28"/>
           <w:lang w:val="en-US"/>
         </w:rPr>
       </w:pPr>
@@ -95,6 +203,8 @@
           <w:rFonts w:ascii="Times New Roman" w:hAnsi="Times New Roman" w:cs="Times New Roman"/>
           <w:b/>
           <w:bCs/>
+          <w:sz w:val="28"/>
+          <w:szCs w:val="28"/>
           <w:lang w:val="en-US"/>
         </w:rPr>
         <w:t xml:space="preserve">Why It Matters </w:t>
@@ -110,15 +220,28 @@
         <w:spacing w:line="360" w:lineRule="auto"/>
         <w:rPr>
           <w:rFonts w:ascii="Times New Roman" w:hAnsi="Times New Roman" w:cs="Times New Roman"/>
-          <w:lang w:val="en-US"/>
-        </w:rPr>
-      </w:pPr>
-      <w:r>
-        <w:rPr>
-          <w:rFonts w:ascii="Times New Roman" w:hAnsi="Times New Roman" w:cs="Times New Roman"/>
-          <w:lang w:val="en-US"/>
-        </w:rPr>
-        <w:t xml:space="preserve">Delayed requests </w:t>
+          <w:sz w:val="28"/>
+          <w:szCs w:val="28"/>
+          <w:lang w:val="en-US"/>
+        </w:rPr>
+      </w:pPr>
+      <w:r>
+        <w:rPr>
+          <w:rFonts w:ascii="Times New Roman" w:hAnsi="Times New Roman" w:cs="Times New Roman"/>
+          <w:sz w:val="28"/>
+          <w:szCs w:val="28"/>
+          <w:lang w:val="en-US"/>
+        </w:rPr>
+        <w:t>Delayed request</w:t>
+      </w:r>
+      <w:r>
+        <w:rPr>
+          <w:rFonts w:ascii="Times New Roman" w:hAnsi="Times New Roman" w:cs="Times New Roman"/>
+          <w:sz w:val="28"/>
+          <w:szCs w:val="28"/>
+          <w:lang w:val="en-US"/>
+        </w:rPr>
+        <w:t xml:space="preserve"> processing</w:t>
       </w:r>
     </w:p>
     <w:p>
@@ -131,15 +254,37 @@
         <w:spacing w:line="360" w:lineRule="auto"/>
         <w:rPr>
           <w:rFonts w:ascii="Times New Roman" w:hAnsi="Times New Roman" w:cs="Times New Roman"/>
-          <w:lang w:val="en-US"/>
-        </w:rPr>
-      </w:pPr>
-      <w:r>
-        <w:rPr>
-          <w:rFonts w:ascii="Times New Roman" w:hAnsi="Times New Roman" w:cs="Times New Roman"/>
-          <w:lang w:val="en-US"/>
-        </w:rPr>
-        <w:t>Lost requests</w:t>
+          <w:sz w:val="28"/>
+          <w:szCs w:val="28"/>
+          <w:lang w:val="en-US"/>
+        </w:rPr>
+      </w:pPr>
+      <w:r>
+        <w:rPr>
+          <w:rFonts w:ascii="Times New Roman" w:hAnsi="Times New Roman" w:cs="Times New Roman"/>
+          <w:sz w:val="28"/>
+          <w:szCs w:val="28"/>
+          <w:lang w:val="en-US"/>
+        </w:rPr>
+        <w:t xml:space="preserve">Lost </w:t>
+      </w:r>
+      <w:r>
+        <w:rPr>
+          <w:rFonts w:ascii="Times New Roman" w:hAnsi="Times New Roman" w:cs="Times New Roman"/>
+          <w:sz w:val="28"/>
+          <w:szCs w:val="28"/>
+          <w:lang w:val="en-US"/>
+        </w:rPr>
+        <w:t xml:space="preserve">or overlooked </w:t>
+      </w:r>
+      <w:r>
+        <w:rPr>
+          <w:rFonts w:ascii="Times New Roman" w:hAnsi="Times New Roman" w:cs="Times New Roman"/>
+          <w:sz w:val="28"/>
+          <w:szCs w:val="28"/>
+          <w:lang w:val="en-US"/>
+        </w:rPr>
+        <w:t>requests</w:t>
       </w:r>
     </w:p>
     <w:p>
@@ -152,22 +297,19 @@
         <w:spacing w:line="360" w:lineRule="auto"/>
         <w:rPr>
           <w:rFonts w:ascii="Times New Roman" w:hAnsi="Times New Roman" w:cs="Times New Roman"/>
-          <w:lang w:val="en-US"/>
-        </w:rPr>
-      </w:pPr>
-      <w:r>
-        <w:rPr>
-          <w:rFonts w:ascii="Times New Roman" w:hAnsi="Times New Roman" w:cs="Times New Roman"/>
-          <w:lang w:val="en-US"/>
-        </w:rPr>
-        <w:t>Who approved the request</w:t>
-      </w:r>
-      <w:r>
-        <w:rPr>
-          <w:rFonts w:ascii="Times New Roman" w:hAnsi="Times New Roman" w:cs="Times New Roman"/>
-          <w:lang w:val="en-US"/>
-        </w:rPr>
-        <w:t>?</w:t>
+          <w:sz w:val="28"/>
+          <w:szCs w:val="28"/>
+          <w:lang w:val="en-US"/>
+        </w:rPr>
+      </w:pPr>
+      <w:r>
+        <w:rPr>
+          <w:rFonts w:ascii="Times New Roman" w:hAnsi="Times New Roman" w:cs="Times New Roman"/>
+          <w:sz w:val="28"/>
+          <w:szCs w:val="28"/>
+          <w:lang w:val="en-US"/>
+        </w:rPr>
+        <w:t>Unclear approval records</w:t>
       </w:r>
     </w:p>
     <w:p>
@@ -180,15 +322,37 @@
         <w:spacing w:line="360" w:lineRule="auto"/>
         <w:rPr>
           <w:rFonts w:ascii="Times New Roman" w:hAnsi="Times New Roman" w:cs="Times New Roman"/>
-          <w:lang w:val="en-US"/>
-        </w:rPr>
-      </w:pPr>
-      <w:r>
-        <w:rPr>
-          <w:rFonts w:ascii="Times New Roman" w:hAnsi="Times New Roman" w:cs="Times New Roman"/>
-          <w:lang w:val="en-US"/>
-        </w:rPr>
-        <w:t>No request status</w:t>
+          <w:sz w:val="28"/>
+          <w:szCs w:val="28"/>
+          <w:lang w:val="en-US"/>
+        </w:rPr>
+      </w:pPr>
+      <w:r>
+        <w:rPr>
+          <w:rFonts w:ascii="Times New Roman" w:hAnsi="Times New Roman" w:cs="Times New Roman"/>
+          <w:sz w:val="28"/>
+          <w:szCs w:val="28"/>
+          <w:lang w:val="en-US"/>
+        </w:rPr>
+        <w:t xml:space="preserve">No </w:t>
+      </w:r>
+      <w:r>
+        <w:rPr>
+          <w:rFonts w:ascii="Times New Roman" w:hAnsi="Times New Roman" w:cs="Times New Roman"/>
+          <w:sz w:val="28"/>
+          <w:szCs w:val="28"/>
+          <w:lang w:val="en-US"/>
+        </w:rPr>
+        <w:t xml:space="preserve">visible </w:t>
+      </w:r>
+      <w:r>
+        <w:rPr>
+          <w:rFonts w:ascii="Times New Roman" w:hAnsi="Times New Roman" w:cs="Times New Roman"/>
+          <w:sz w:val="28"/>
+          <w:szCs w:val="28"/>
+          <w:lang w:val="en-US"/>
+        </w:rPr>
+        <w:t>request status</w:t>
       </w:r>
     </w:p>
     <w:p>
@@ -201,15 +365,37 @@
         <w:spacing w:line="360" w:lineRule="auto"/>
         <w:rPr>
           <w:rFonts w:ascii="Times New Roman" w:hAnsi="Times New Roman" w:cs="Times New Roman"/>
-          <w:lang w:val="en-US"/>
-        </w:rPr>
-      </w:pPr>
-      <w:r>
-        <w:rPr>
-          <w:rFonts w:ascii="Times New Roman" w:hAnsi="Times New Roman" w:cs="Times New Roman"/>
-          <w:lang w:val="en-US"/>
-        </w:rPr>
-        <w:t xml:space="preserve">Inconsistent swap rules </w:t>
+          <w:sz w:val="28"/>
+          <w:szCs w:val="28"/>
+          <w:lang w:val="en-US"/>
+        </w:rPr>
+      </w:pPr>
+      <w:r>
+        <w:rPr>
+          <w:rFonts w:ascii="Times New Roman" w:hAnsi="Times New Roman" w:cs="Times New Roman"/>
+          <w:sz w:val="28"/>
+          <w:szCs w:val="28"/>
+          <w:lang w:val="en-US"/>
+        </w:rPr>
+        <w:t xml:space="preserve">Inconsistent </w:t>
+      </w:r>
+      <w:r>
+        <w:rPr>
+          <w:rFonts w:ascii="Times New Roman" w:hAnsi="Times New Roman" w:cs="Times New Roman"/>
+          <w:sz w:val="28"/>
+          <w:szCs w:val="28"/>
+          <w:lang w:val="en-US"/>
+        </w:rPr>
+        <w:t>applications of shift-</w:t>
+      </w:r>
+      <w:r>
+        <w:rPr>
+          <w:rFonts w:ascii="Times New Roman" w:hAnsi="Times New Roman" w:cs="Times New Roman"/>
+          <w:sz w:val="28"/>
+          <w:szCs w:val="28"/>
+          <w:lang w:val="en-US"/>
+        </w:rPr>
+        <w:t xml:space="preserve">swap rules </w:t>
       </w:r>
     </w:p>
     <w:p>
@@ -219,6 +405,8 @@
           <w:rFonts w:ascii="Times New Roman" w:hAnsi="Times New Roman" w:cs="Times New Roman"/>
           <w:b/>
           <w:bCs/>
+          <w:sz w:val="28"/>
+          <w:szCs w:val="28"/>
           <w:lang w:val="en-US"/>
         </w:rPr>
       </w:pPr>
@@ -227,6 +415,8 @@
           <w:rFonts w:ascii="Times New Roman" w:hAnsi="Times New Roman" w:cs="Times New Roman"/>
           <w:b/>
           <w:bCs/>
+          <w:sz w:val="28"/>
+          <w:szCs w:val="28"/>
           <w:lang w:val="en-US"/>
         </w:rPr>
         <w:t>In Scope</w:t>
@@ -237,26 +427,106 @@
         <w:spacing w:line="360" w:lineRule="auto"/>
         <w:rPr>
           <w:rFonts w:ascii="Times New Roman" w:hAnsi="Times New Roman" w:cs="Times New Roman"/>
-          <w:lang w:val="en-US"/>
-        </w:rPr>
-      </w:pPr>
-      <w:r>
-        <w:rPr>
-          <w:rFonts w:ascii="Times New Roman" w:hAnsi="Times New Roman" w:cs="Times New Roman"/>
-          <w:lang w:val="en-US"/>
-        </w:rPr>
-        <w:t xml:space="preserve">Submit one shift-swap request between two employees, </w:t>
-      </w:r>
-      <w:r>
-        <w:rPr>
-          <w:rFonts w:ascii="Times New Roman" w:hAnsi="Times New Roman" w:cs="Times New Roman"/>
-          <w:lang w:val="en-US"/>
-        </w:rPr>
-        <w:t>check that both employees are qualified for the other roles</w:t>
-      </w:r>
-      <w:r>
-        <w:rPr>
-          <w:rFonts w:ascii="Times New Roman" w:hAnsi="Times New Roman" w:cs="Times New Roman"/>
+          <w:sz w:val="28"/>
+          <w:szCs w:val="28"/>
+          <w:lang w:val="en-US"/>
+        </w:rPr>
+      </w:pPr>
+      <w:r>
+        <w:rPr>
+          <w:rFonts w:ascii="Times New Roman" w:hAnsi="Times New Roman" w:cs="Times New Roman"/>
+          <w:sz w:val="28"/>
+          <w:szCs w:val="28"/>
+          <w:lang w:val="en-US"/>
+        </w:rPr>
+        <w:t xml:space="preserve">The system will support </w:t>
+      </w:r>
+      <w:r>
+        <w:rPr>
+          <w:rFonts w:ascii="Times New Roman" w:hAnsi="Times New Roman" w:cs="Times New Roman"/>
+          <w:sz w:val="28"/>
+          <w:szCs w:val="28"/>
+          <w:lang w:val="en-US"/>
+        </w:rPr>
+        <w:t>submitting</w:t>
+      </w:r>
+      <w:r>
+        <w:rPr>
+          <w:rFonts w:ascii="Times New Roman" w:hAnsi="Times New Roman" w:cs="Times New Roman"/>
+          <w:sz w:val="28"/>
+          <w:szCs w:val="28"/>
+          <w:lang w:val="en-US"/>
+        </w:rPr>
+        <w:t xml:space="preserve"> </w:t>
+      </w:r>
+      <w:r>
+        <w:rPr>
+          <w:rFonts w:ascii="Times New Roman" w:hAnsi="Times New Roman" w:cs="Times New Roman"/>
+          <w:sz w:val="28"/>
+          <w:szCs w:val="28"/>
+          <w:lang w:val="en-US"/>
+        </w:rPr>
+        <w:t>a</w:t>
+      </w:r>
+      <w:r>
+        <w:rPr>
+          <w:rFonts w:ascii="Times New Roman" w:hAnsi="Times New Roman" w:cs="Times New Roman"/>
+          <w:sz w:val="28"/>
+          <w:szCs w:val="28"/>
+          <w:lang w:val="en-US"/>
+        </w:rPr>
+        <w:t xml:space="preserve"> shift-swap request between two employees, </w:t>
+      </w:r>
+      <w:r>
+        <w:rPr>
+          <w:rFonts w:ascii="Times New Roman" w:hAnsi="Times New Roman" w:cs="Times New Roman"/>
+          <w:sz w:val="28"/>
+          <w:szCs w:val="28"/>
+          <w:lang w:val="en-US"/>
+        </w:rPr>
+        <w:t xml:space="preserve">confirming the receiving </w:t>
+      </w:r>
+      <w:r>
+        <w:rPr>
+          <w:rFonts w:ascii="Times New Roman" w:hAnsi="Times New Roman" w:cs="Times New Roman"/>
+          <w:sz w:val="28"/>
+          <w:szCs w:val="28"/>
+          <w:lang w:val="en-US"/>
+        </w:rPr>
+        <w:t>employee’s</w:t>
+      </w:r>
+      <w:r>
+        <w:rPr>
+          <w:rFonts w:ascii="Times New Roman" w:hAnsi="Times New Roman" w:cs="Times New Roman"/>
+          <w:sz w:val="28"/>
+          <w:szCs w:val="28"/>
+          <w:lang w:val="en-US"/>
+        </w:rPr>
+        <w:t xml:space="preserve"> acceptance, verify</w:t>
+      </w:r>
+      <w:r>
+        <w:rPr>
+          <w:rFonts w:ascii="Times New Roman" w:hAnsi="Times New Roman" w:cs="Times New Roman"/>
+          <w:sz w:val="28"/>
+          <w:szCs w:val="28"/>
+          <w:lang w:val="en-US"/>
+        </w:rPr>
+        <w:t xml:space="preserve"> that both employees are qualified for th</w:t>
+      </w:r>
+      <w:r>
+        <w:rPr>
+          <w:rFonts w:ascii="Times New Roman" w:hAnsi="Times New Roman" w:cs="Times New Roman"/>
+          <w:sz w:val="28"/>
+          <w:szCs w:val="28"/>
+          <w:lang w:val="en-US"/>
+        </w:rPr>
+        <w:t>eir proposed shifts</w:t>
+      </w:r>
+      <w:r>
+        <w:rPr>
+          <w:rFonts w:ascii="Times New Roman" w:hAnsi="Times New Roman" w:cs="Times New Roman"/>
+          <w:sz w:val="28"/>
+          <w:szCs w:val="28"/>
           <w:lang w:val="en-US"/>
         </w:rPr>
         <w:t xml:space="preserve">, validate that </w:t>
@@ -264,6 +534,8 @@
       <w:r>
         <w:rPr>
           <w:rFonts w:ascii="Times New Roman" w:hAnsi="Times New Roman" w:cs="Times New Roman"/>
+          <w:sz w:val="28"/>
+          <w:szCs w:val="28"/>
           <w:lang w:val="en-US"/>
         </w:rPr>
         <w:t>there is no schedule conflict</w:t>
@@ -271,6 +543,8 @@
       <w:r>
         <w:rPr>
           <w:rFonts w:ascii="Times New Roman" w:hAnsi="Times New Roman" w:cs="Times New Roman"/>
+          <w:sz w:val="28"/>
+          <w:szCs w:val="28"/>
           <w:lang w:val="en-US"/>
         </w:rPr>
         <w:t xml:space="preserve"> or overtime</w:t>
@@ -278,6 +552,8 @@
       <w:r>
         <w:rPr>
           <w:rFonts w:ascii="Times New Roman" w:hAnsi="Times New Roman" w:cs="Times New Roman"/>
+          <w:sz w:val="28"/>
+          <w:szCs w:val="28"/>
           <w:lang w:val="en-US"/>
         </w:rPr>
         <w:t xml:space="preserve">, </w:t>
@@ -285,13 +561,53 @@
       <w:r>
         <w:rPr>
           <w:rFonts w:ascii="Times New Roman" w:hAnsi="Times New Roman" w:cs="Times New Roman"/>
-          <w:lang w:val="en-US"/>
-        </w:rPr>
-        <w:t>manager approval, show request status</w:t>
-      </w:r>
-      <w:r>
-        <w:rPr>
-          <w:rFonts w:ascii="Times New Roman" w:hAnsi="Times New Roman" w:cs="Times New Roman"/>
+          <w:sz w:val="28"/>
+          <w:szCs w:val="28"/>
+          <w:lang w:val="en-US"/>
+        </w:rPr>
+        <w:t xml:space="preserve">manager approval, </w:t>
+      </w:r>
+      <w:r>
+        <w:rPr>
+          <w:rFonts w:ascii="Times New Roman" w:hAnsi="Times New Roman" w:cs="Times New Roman"/>
+          <w:sz w:val="28"/>
+          <w:szCs w:val="28"/>
+          <w:lang w:val="en-US"/>
+        </w:rPr>
+        <w:t>displaying</w:t>
+      </w:r>
+      <w:r>
+        <w:rPr>
+          <w:rFonts w:ascii="Times New Roman" w:hAnsi="Times New Roman" w:cs="Times New Roman"/>
+          <w:sz w:val="28"/>
+          <w:szCs w:val="28"/>
+          <w:lang w:val="en-US"/>
+        </w:rPr>
+        <w:t xml:space="preserve"> request status</w:t>
+      </w:r>
+      <w:r>
+        <w:rPr>
+          <w:rFonts w:ascii="Times New Roman" w:hAnsi="Times New Roman" w:cs="Times New Roman"/>
+          <w:sz w:val="28"/>
+          <w:szCs w:val="28"/>
+          <w:lang w:val="en-US"/>
+        </w:rPr>
+        <w:t xml:space="preserve">, and updating both employees schedules after </w:t>
+      </w:r>
+      <w:r>
+        <w:rPr>
+          <w:rFonts w:ascii="Times New Roman" w:hAnsi="Times New Roman" w:cs="Times New Roman"/>
+          <w:sz w:val="28"/>
+          <w:szCs w:val="28"/>
+          <w:lang w:val="en-US"/>
+        </w:rPr>
+        <w:t>approval</w:t>
+      </w:r>
+      <w:r>
+        <w:rPr>
+          <w:rFonts w:ascii="Times New Roman" w:hAnsi="Times New Roman" w:cs="Times New Roman"/>
+          <w:sz w:val="28"/>
+          <w:szCs w:val="28"/>
           <w:lang w:val="en-US"/>
         </w:rPr>
         <w:t>.</w:t>
@@ -304,47 +620,153 @@
           <w:rFonts w:ascii="Times New Roman" w:hAnsi="Times New Roman" w:cs="Times New Roman"/>
           <w:b/>
           <w:bCs/>
-          <w:lang w:val="en-US"/>
-        </w:rPr>
-      </w:pPr>
-      <w:r>
+          <w:sz w:val="28"/>
+          <w:szCs w:val="28"/>
+          <w:lang w:val="en-US"/>
+        </w:rPr>
+      </w:pPr>
+    </w:p>
+    <w:p>
+      <w:pPr>
+        <w:spacing w:line="360" w:lineRule="auto"/>
         <w:rPr>
           <w:rFonts w:ascii="Times New Roman" w:hAnsi="Times New Roman" w:cs="Times New Roman"/>
           <w:b/>
           <w:bCs/>
-          <w:lang w:val="en-US"/>
-        </w:rPr>
-        <w:t>Out of scope</w:t>
-      </w:r>
+          <w:sz w:val="28"/>
+          <w:szCs w:val="28"/>
+          <w:lang w:val="en-US"/>
+        </w:rPr>
+      </w:pPr>
     </w:p>
     <w:p>
       <w:pPr>
         <w:spacing w:line="360" w:lineRule="auto"/>
         <w:rPr>
           <w:rFonts w:ascii="Times New Roman" w:hAnsi="Times New Roman" w:cs="Times New Roman"/>
-          <w:lang w:val="en-US"/>
-        </w:rPr>
-      </w:pPr>
-      <w:r>
-        <w:rPr>
-          <w:rFonts w:ascii="Times New Roman" w:hAnsi="Times New Roman" w:cs="Times New Roman"/>
-          <w:lang w:val="en-US"/>
-        </w:rPr>
-        <w:t xml:space="preserve">Schedule creation, </w:t>
-      </w:r>
-      <w:r>
-        <w:rPr>
-          <w:rFonts w:ascii="Times New Roman" w:hAnsi="Times New Roman" w:cs="Times New Roman"/>
-          <w:lang w:val="en-US"/>
-        </w:rPr>
-        <w:t>wage calculation</w:t>
-      </w:r>
-      <w:r>
-        <w:rPr>
-          <w:rFonts w:ascii="Times New Roman" w:hAnsi="Times New Roman" w:cs="Times New Roman"/>
-          <w:lang w:val="en-US"/>
-        </w:rPr>
-        <w:t>, hiring new employees.</w:t>
+          <w:b/>
+          <w:bCs/>
+          <w:sz w:val="28"/>
+          <w:szCs w:val="28"/>
+          <w:lang w:val="en-US"/>
+        </w:rPr>
+      </w:pPr>
+      <w:r>
+        <w:rPr>
+          <w:rFonts w:ascii="Times New Roman" w:hAnsi="Times New Roman" w:cs="Times New Roman"/>
+          <w:b/>
+          <w:bCs/>
+          <w:sz w:val="28"/>
+          <w:szCs w:val="28"/>
+          <w:lang w:val="en-US"/>
+        </w:rPr>
+        <w:lastRenderedPageBreak/>
+        <w:t xml:space="preserve">Out of </w:t>
+      </w:r>
+      <w:r>
+        <w:rPr>
+          <w:rFonts w:ascii="Times New Roman" w:hAnsi="Times New Roman" w:cs="Times New Roman"/>
+          <w:b/>
+          <w:bCs/>
+          <w:sz w:val="28"/>
+          <w:szCs w:val="28"/>
+          <w:lang w:val="en-US"/>
+        </w:rPr>
+        <w:t>S</w:t>
+      </w:r>
+      <w:r>
+        <w:rPr>
+          <w:rFonts w:ascii="Times New Roman" w:hAnsi="Times New Roman" w:cs="Times New Roman"/>
+          <w:b/>
+          <w:bCs/>
+          <w:sz w:val="28"/>
+          <w:szCs w:val="28"/>
+          <w:lang w:val="en-US"/>
+        </w:rPr>
+        <w:t>cope</w:t>
+      </w:r>
+    </w:p>
+    <w:p>
+      <w:pPr>
+        <w:spacing w:line="360" w:lineRule="auto"/>
+        <w:rPr>
+          <w:rFonts w:ascii="Times New Roman" w:hAnsi="Times New Roman" w:cs="Times New Roman"/>
+          <w:sz w:val="28"/>
+          <w:szCs w:val="28"/>
+          <w:lang w:val="en-US"/>
+        </w:rPr>
+      </w:pPr>
+      <w:r>
+        <w:rPr>
+          <w:rFonts w:ascii="Times New Roman" w:hAnsi="Times New Roman" w:cs="Times New Roman"/>
+          <w:sz w:val="28"/>
+          <w:szCs w:val="28"/>
+          <w:lang w:val="en-US"/>
+        </w:rPr>
+        <w:t>The system will not include employee s</w:t>
+      </w:r>
+      <w:r>
+        <w:rPr>
+          <w:rFonts w:ascii="Times New Roman" w:hAnsi="Times New Roman" w:cs="Times New Roman"/>
+          <w:sz w:val="28"/>
+          <w:szCs w:val="28"/>
+          <w:lang w:val="en-US"/>
+        </w:rPr>
+        <w:t xml:space="preserve">chedule creation, </w:t>
+      </w:r>
+      <w:r>
+        <w:rPr>
+          <w:rFonts w:ascii="Times New Roman" w:hAnsi="Times New Roman" w:cs="Times New Roman"/>
+          <w:sz w:val="28"/>
+          <w:szCs w:val="28"/>
+          <w:lang w:val="en-US"/>
+        </w:rPr>
+        <w:t xml:space="preserve">wage </w:t>
+      </w:r>
+      <w:r>
+        <w:rPr>
+          <w:rFonts w:ascii="Times New Roman" w:hAnsi="Times New Roman" w:cs="Times New Roman"/>
+          <w:sz w:val="28"/>
+          <w:szCs w:val="28"/>
+          <w:lang w:val="en-US"/>
+        </w:rPr>
+        <w:t xml:space="preserve">or payroll </w:t>
+      </w:r>
+      <w:r>
+        <w:rPr>
+          <w:rFonts w:ascii="Times New Roman" w:hAnsi="Times New Roman" w:cs="Times New Roman"/>
+          <w:sz w:val="28"/>
+          <w:szCs w:val="28"/>
+          <w:lang w:val="en-US"/>
+        </w:rPr>
+        <w:t>calculation</w:t>
+      </w:r>
+      <w:r>
+        <w:rPr>
+          <w:rFonts w:ascii="Times New Roman" w:hAnsi="Times New Roman" w:cs="Times New Roman"/>
+          <w:sz w:val="28"/>
+          <w:szCs w:val="28"/>
+          <w:lang w:val="en-US"/>
+        </w:rPr>
+        <w:t>,</w:t>
+      </w:r>
+      <w:r>
+        <w:rPr>
+          <w:rFonts w:ascii="Times New Roman" w:hAnsi="Times New Roman" w:cs="Times New Roman"/>
+          <w:sz w:val="28"/>
+          <w:szCs w:val="28"/>
+          <w:lang w:val="en-US"/>
+        </w:rPr>
+        <w:t xml:space="preserve"> or the</w:t>
+      </w:r>
+      <w:r>
+        <w:rPr>
+          <w:rFonts w:ascii="Times New Roman" w:hAnsi="Times New Roman" w:cs="Times New Roman"/>
+          <w:sz w:val="28"/>
+          <w:szCs w:val="28"/>
+          <w:lang w:val="en-US"/>
+        </w:rPr>
+        <w:t xml:space="preserve"> hiring new employees.</w:t>
       </w:r>
     </w:p>
     <w:sectPr>

</xml_diff>